<commit_message>
docs: add GitHub repo URL to README and Nexus BBCode
</commit_message>
<xml_diff>
--- a/docs/README.docx
+++ b/docs/README.docx
@@ -1483,11 +1483,42 @@
       <w:pPr>
         <w:pStyle w:val="Heading2"/>
       </w:pPr>
-      <w:bookmarkStart w:id="32" w:name="license"/>
+      <w:bookmarkStart w:id="32" w:name="source-code"/>
+      <w:r>
+        <w:t xml:space="preserve">Source code</w:t>
+      </w:r>
+      <w:bookmarkEnd w:id="32"/>
+    </w:p>
+    <w:p>
+      <w:pPr>
+        <w:pStyle w:val="FirstParagraph"/>
+      </w:pPr>
+      <w:r>
+        <w:t xml:space="preserve">CCNS is open source. The full source — UI files, Script Extender Lua, build scripts, and these documents — lives on GitHub:</w:t>
+      </w:r>
+    </w:p>
+    <w:p>
+      <w:pPr>
+        <w:pStyle w:val="BodyText"/>
+      </w:pPr>
+      <w:hyperlink r:id="rId33">
+        <w:r>
+          <w:rPr>
+            <w:rStyle w:val="Hyperlink"/>
+          </w:rPr>
+          <w:t xml:space="preserve">https://github.com/Shiney1965/BG3-CC-Mod-Head-and-Hair</w:t>
+        </w:r>
+      </w:hyperlink>
+    </w:p>
+    <w:p>
+      <w:pPr>
+        <w:pStyle w:val="Heading2"/>
+      </w:pPr>
+      <w:bookmarkStart w:id="34" w:name="license"/>
       <w:r>
         <w:t xml:space="preserve">License</w:t>
       </w:r>
-      <w:bookmarkEnd w:id="32"/>
+      <w:bookmarkEnd w:id="34"/>
     </w:p>
     <w:p>
       <w:pPr>
@@ -1525,18 +1556,32 @@
       <w:pPr>
         <w:pStyle w:val="Heading2"/>
       </w:pPr>
-      <w:bookmarkStart w:id="33" w:name="reporting-issues"/>
+      <w:bookmarkStart w:id="35" w:name="reporting-issues"/>
       <w:r>
         <w:t xml:space="preserve">Reporting issues</w:t>
       </w:r>
-      <w:bookmarkEnd w:id="33"/>
+      <w:bookmarkEnd w:id="35"/>
     </w:p>
     <w:p>
       <w:pPr>
         <w:pStyle w:val="FirstParagraph"/>
       </w:pPr>
       <w:r>
-        <w:t xml:space="preserve">Drop a comment on the NexusMods listing. When reporting, please include:</w:t>
+        <w:t xml:space="preserve">Drop a comment on the NexusMods listing, or open an issue on the</w:t>
+      </w:r>
+      <w:r>
+        <w:t xml:space="preserve"> </w:t>
+      </w:r>
+      <w:hyperlink r:id="rId33">
+        <w:r>
+          <w:rPr>
+            <w:rStyle w:val="Hyperlink"/>
+          </w:rPr>
+          <w:t xml:space="preserve">GitHub repository</w:t>
+        </w:r>
+      </w:hyperlink>
+      <w:r>
+        <w:t xml:space="preserve">. When reporting, please include:</w:t>
       </w:r>
     </w:p>
     <w:p>
@@ -1560,70 +1605,7 @@
         <w:pStyle w:val="Compact"/>
       </w:pPr>
       <w:r>
-        <w:t xml:space="preserve">Whether you are on keyboard or controller.</w:t>
-      </w:r>
-    </w:p>
-    <w:p>
-      <w:pPr>
-        <w:numPr>
-          <w:ilvl w:val="0"/>
-          <w:numId w:val="1007"/>
-        </w:numPr>
-        <w:pStyle w:val="Compact"/>
-      </w:pPr>
-      <w:r>
-        <w:t xml:space="preserve">Your Script Extender console log from the session where the problem happened.</w:t>
-      </w:r>
-    </w:p>
-    <w:p>
-      <w:pPr>
-        <w:numPr>
-          <w:ilvl w:val="0"/>
-          <w:numId w:val="1007"/>
-        </w:numPr>
-        <w:pStyle w:val="Compact"/>
-      </w:pPr>
-      <w:r>
-        <w:t xml:space="preserve">The other UI / character-creation mods in your load order (especially anything that modifies</w:t>
-      </w:r>
-      <w:r>
-        <w:t xml:space="preserve"> </w:t>
-      </w:r>
-      <w:r>
-        <w:rPr>
-          <w:rStyle w:val="VerbatimChar"/>
-        </w:rPr>
-        <w:t xml:space="preserve">CCLib_k.xaml</w:t>
-      </w:r>
-      <w:r>
-        <w:t xml:space="preserve"> </w:t>
-      </w:r>
-      <w:r>
-        <w:t xml:space="preserve">or</w:t>
-      </w:r>
-      <w:r>
-        <w:t xml:space="preserve"> </w:t>
-      </w:r>
-      <w:r>
-        <w:rPr>
-          <w:rStyle w:val="VerbatimChar"/>
-        </w:rPr>
-        <w:t xml:space="preserve">CCLib_c.xaml</w:t>
-      </w:r>
-      <w:r>
-        <w:t xml:space="preserve">).</w:t>
-      </w:r>
-    </w:p>
-    <w:p>
-      <w:pPr>
-        <w:numPr>
-          <w:ilvl w:val="0"/>
-          <w:numId w:val="1007"/>
-        </w:numPr>
-        <w:pStyle w:val="Compact"/>
-      </w:pPr>
-      <w:r>
-        <w:t xml:space="preserve">Which hair/head option or which screen the problem appears on.</w:t>
+        <w:t xml:space="preserve">Whether you ar</w:t>
       </w:r>
     </w:p>
     <w:sectPr/>

</xml_diff>

<commit_message>
v11.13: number all hair/head tiles (including vanilla) in CC grid order
- numberTilesFromCC now numbers every tile, not just modded ones: vanilla tiles get '#i <name>', modded still get '#i <name>\n<mod>'. Makes the ~100 unlocked vanilla hairs/heads reachable by tile-# and Prev/Next.
- Lua-only change vs v11.12; XAML byte-identical to the v11.9 baseline; meta.lsx unchanged.
- Docs conformed: all head and hair options are numbered in the order they appear in the CC grid (README .md/.docx/.pdf + Nexus BBCode); removed the old 'only modded tiles are numbered' wording.
- Adds src_v11_13/ and scripts/build_and_install_v11_13.ps1. (v11.12 was an unshipped metadata-only interim.)
</commit_message>
<xml_diff>
--- a/docs/README.docx
+++ b/docs/README.docx
@@ -77,7 +77,7 @@
         <w:pStyle w:val="FirstParagraph"/>
       </w:pPr>
       <w:r>
-        <w:t xml:space="preserve">If you run a lot of hair and head mods, you have probably scrolled through hundreds of near-identical thumbnails with no idea which mod a style came from or where in the grid it was. CCNS puts a readable name and source-mod under every tile, numbers the modded ones, and gives you a search box that filters by name</w:t>
+        <w:t xml:space="preserve">If you run a lot of hair and head mods, you have probably scrolled through hundreds of near-identical thumbnails with no idea which mod a style came from or where in the grid it was. CCNS puts a readable name and source-mod under every tile, numbers them all in grid order, and gives you a search box that filters by name</w:t>
       </w:r>
       <w:r>
         <w:t xml:space="preserve"> </w:t>
@@ -453,7 +453,7 @@
         <w:t xml:space="preserve"> </w:t>
       </w:r>
       <w:r>
-        <w:t xml:space="preserve">— each modded hair/head tile is numbered (</w:t>
+        <w:t xml:space="preserve">— all head and hair options are numbered in grid order (</w:t>
       </w:r>
       <w:r>
         <w:rPr>
@@ -1436,7 +1436,7 @@
         <w:t xml:space="preserve"> </w:t>
       </w:r>
       <w:r>
-        <w:t xml:space="preserve">The game’s hair/head tile collections are read-only at runtime, so CCNS cannot draw a glow on matching tiles, hide non-matches, or scroll the grid to a match. Instead, each modded tile is numbered and the search panel’s</w:t>
+        <w:t xml:space="preserve">The game’s hair/head tile collections are read-only at runtime, so CCNS cannot draw a glow on matching tiles, hide non-matches, or scroll the grid to a match. Instead, each tile is numbered and the search panel’s</w:t>
       </w:r>
       <w:r>
         <w:t xml:space="preserve"> </w:t>
@@ -1452,27 +1452,6 @@
       </w:r>
       <w:r>
         <w:t xml:space="preserve">navigation tells you which numbered tile to look at. This is a hard engine limitation.</w:t>
-      </w:r>
-    </w:p>
-    <w:p>
-      <w:pPr>
-        <w:numPr>
-          <w:ilvl w:val="0"/>
-          <w:numId w:val="1007"/>
-        </w:numPr>
-        <w:pStyle w:val="Compact"/>
-      </w:pPr>
-      <w:r>
-        <w:rPr>
-          <w:b/>
-        </w:rPr>
-        <w:t xml:space="preserve">Only modded tiles are numbered.</w:t>
-      </w:r>
-      <w:r>
-        <w:t xml:space="preserve"> </w:t>
-      </w:r>
-      <w:r>
-        <w:t xml:space="preserve">Base-game (vanilla) hair/head options are intentionally left unnumbered to keep the grid clean and avoid touching base-game text.</w:t>
       </w:r>
     </w:p>
     <w:p>

</xml_diff>